<commit_message>
Prompt-ablation figures: line grids without CI whiskers, Figure-3-style rating grid, larger legends below axes
Co-Authored-By: Claude Opus 5 (1M context) <noreply@anthropic.com>
</commit_message>
<xml_diff>
--- a/reports/prompt_ablation_results.docx
+++ b/reports/prompt_ablation_results.docx
@@ -4569,7 +4569,7 @@
       <w:r>
         <w:drawing>
           <wp:inline xmlns:a="http://schemas.openxmlformats.org/drawingml/2006/main" xmlns:pic="http://schemas.openxmlformats.org/drawingml/2006/picture">
-            <wp:extent cx="8229600" cy="7378872"/>
+            <wp:extent cx="8229600" cy="7580325"/>
             <wp:docPr id="1" name="Picture 1"/>
             <wp:cNvGraphicFramePr>
               <a:graphicFrameLocks noChangeAspect="1"/>
@@ -4590,7 +4590,7 @@
                   <pic:spPr>
                     <a:xfrm>
                       <a:off x="0" y="0"/>
-                      <a:ext cx="8229600" cy="7378872"/>
+                      <a:ext cx="8229600" cy="7580325"/>
                     </a:xfrm>
                     <a:prstGeom prst="rect"/>
                   </pic:spPr>
@@ -4610,7 +4610,7 @@
           <w:i/>
           <w:sz w:val="18"/>
         </w:rPr>
-        <w:t>Figure 1. Exact accuracy, macro-F1, and QWK by rating domain with 95% participant-clustered bootstrap intervals. Lines connect configurations evaluated on the same canonical test messages.</w:t>
+        <w:t>Figure 1. Exact accuracy, macro-F1, and QWK by rating domain. Lines connect configurations evaluated on the same canonical test messages; 95% intervals are given in Tables 1–3.</w:t>
       </w:r>
     </w:p>
     <w:p>
@@ -8423,7 +8423,7 @@
       <w:r>
         <w:drawing>
           <wp:inline xmlns:a="http://schemas.openxmlformats.org/drawingml/2006/main" xmlns:pic="http://schemas.openxmlformats.org/drawingml/2006/picture">
-            <wp:extent cx="8229600" cy="4934221"/>
+            <wp:extent cx="8229600" cy="5160174"/>
             <wp:docPr id="2" name="Picture 2"/>
             <wp:cNvGraphicFramePr>
               <a:graphicFrameLocks noChangeAspect="1"/>
@@ -8444,7 +8444,7 @@
                   <pic:spPr>
                     <a:xfrm>
                       <a:off x="0" y="0"/>
-                      <a:ext cx="8229600" cy="4934221"/>
+                      <a:ext cx="8229600" cy="5160174"/>
                     </a:xfrm>
                     <a:prstGeom prst="rect"/>
                   </pic:spPr>
@@ -8464,7 +8464,7 @@
           <w:i/>
           <w:sz w:val="18"/>
         </w:rPr>
-        <w:t>Figure 2. Directional accuracy and directional macro-F1 by rating domain with 95% intervals. Direction is low (1–2), neutral (3), or high (4–5).</w:t>
+        <w:t>Figure 2. Directional accuracy and directional macro-F1 by rating domain. Direction is low (1–2), neutral (3), or high (4–5).</w:t>
       </w:r>
     </w:p>
     <w:p>
@@ -18487,7 +18487,7 @@
       <w:r>
         <w:drawing>
           <wp:inline xmlns:a="http://schemas.openxmlformats.org/drawingml/2006/main" xmlns:pic="http://schemas.openxmlformats.org/drawingml/2006/picture">
-            <wp:extent cx="8229600" cy="4517966"/>
+            <wp:extent cx="8229600" cy="4707783"/>
             <wp:docPr id="3" name="Picture 3"/>
             <wp:cNvGraphicFramePr>
               <a:graphicFrameLocks noChangeAspect="1"/>
@@ -18508,7 +18508,7 @@
                   <pic:spPr>
                     <a:xfrm>
                       <a:off x="0" y="0"/>
-                      <a:ext cx="8229600" cy="4517966"/>
+                      <a:ext cx="8229600" cy="4707783"/>
                     </a:xfrm>
                     <a:prstGeom prst="rect"/>
                   </pic:spPr>
@@ -25298,7 +25298,7 @@
       <w:r>
         <w:drawing>
           <wp:inline xmlns:a="http://schemas.openxmlformats.org/drawingml/2006/main" xmlns:pic="http://schemas.openxmlformats.org/drawingml/2006/picture">
-            <wp:extent cx="7680960" cy="6886947"/>
+            <wp:extent cx="7680960" cy="6254278"/>
             <wp:docPr id="4" name="Picture 4"/>
             <wp:cNvGraphicFramePr>
               <a:graphicFrameLocks noChangeAspect="1"/>
@@ -25319,7 +25319,7 @@
                   <pic:spPr>
                     <a:xfrm>
                       <a:off x="0" y="0"/>
-                      <a:ext cx="7680960" cy="6886947"/>
+                      <a:ext cx="7680960" cy="6254278"/>
                     </a:xfrm>
                     <a:prstGeom prst="rect"/>
                   </pic:spPr>
@@ -25339,55 +25339,7 @@
           <w:i/>
           <w:sz w:val="18"/>
         </w:rPr>
-        <w:t>Figure 4. Observed versus predicted rating distributions on the 898 held-out messages, by model and domain.</w:t>
-      </w:r>
-    </w:p>
-    <w:p>
-      <w:r>
-        <w:drawing>
-          <wp:inline xmlns:a="http://schemas.openxmlformats.org/drawingml/2006/main" xmlns:pic="http://schemas.openxmlformats.org/drawingml/2006/picture">
-            <wp:extent cx="7680960" cy="6886947"/>
-            <wp:docPr id="5" name="Picture 5"/>
-            <wp:cNvGraphicFramePr>
-              <a:graphicFrameLocks noChangeAspect="1"/>
-            </wp:cNvGraphicFramePr>
-            <a:graphic>
-              <a:graphicData uri="http://schemas.openxmlformats.org/drawingml/2006/picture">
-                <pic:pic>
-                  <pic:nvPicPr>
-                    <pic:cNvPr id="0" name="prompt_ablation_signed_error_distributions_dt10.png"/>
-                    <pic:cNvPicPr/>
-                  </pic:nvPicPr>
-                  <pic:blipFill>
-                    <a:blip r:embed="rId13"/>
-                    <a:stretch>
-                      <a:fillRect/>
-                    </a:stretch>
-                  </pic:blipFill>
-                  <pic:spPr>
-                    <a:xfrm>
-                      <a:off x="0" y="0"/>
-                      <a:ext cx="7680960" cy="6886947"/>
-                    </a:xfrm>
-                    <a:prstGeom prst="rect"/>
-                  </pic:spPr>
-                </pic:pic>
-              </a:graphicData>
-            </a:graphic>
-          </wp:inline>
-        </w:drawing>
-      </w:r>
-    </w:p>
-    <w:p>
-      <w:pPr>
-        <w:jc w:val="center"/>
-      </w:pPr>
-      <w:r>
-        <w:rPr>
-          <w:i/>
-          <w:sz w:val="18"/>
-        </w:rPr>
-        <w:t>Figure 5. Distribution of predicted minus observed rating, by model and domain. Zero is an exact match.</w:t>
+        <w:t>Figure 4. Human versus predicted rating distributions on the 898 held-out messages, by prompt configuration and domain. Gray background bars are the human ratings; coloured bars are each model's predictions.</w:t>
       </w:r>
     </w:p>
     <w:sectPr>

</xml_diff>